<commit_message>
docs(chat): update operation scope capability matrix for delete rules
Refresh the chat access profile reference with clarified delete behavior by scope, conversation management permissions, and the 4 September 2026 revision date.

Co-authored-by: Cursor <cursoragent@cursor.com>
</commit_message>
<xml_diff>
--- a/docs/chat-operation-scope-capabilities-2026-09-03.docx
+++ b/docs/chat-operation-scope-capabilities-2026-09-03.docx
@@ -19,7 +19,21 @@
           <w:color w:val="5B6573"/>
           <w:sz w:val="20"/>
         </w:rPr>
-        <w:t>Access Profile reference | 3 September 2026</w:t>
+        <w:t xml:space="preserve">Access Profile reference | </w:t>
+      </w:r>
+      <w:r>
+        <w:rPr>
+          <w:color w:val="5B6573"/>
+          <w:sz w:val="20"/>
+        </w:rPr>
+        <w:t>4</w:t>
+      </w:r>
+      <w:r>
+        <w:rPr>
+          <w:color w:val="5B6573"/>
+          <w:sz w:val="20"/>
+        </w:rPr>
+        <w:t xml:space="preserve"> September 2026</w:t>
       </w:r>
     </w:p>
     <w:p>
@@ -35,23 +49,7 @@
           <w:color w:val="1F4D78"/>
           <w:sz w:val="20"/>
         </w:rPr>
-        <w:t xml:space="preserve">This matrix describes </w:t>
-      </w:r>
-      <w:proofErr w:type="gramStart"/>
-      <w:r>
-        <w:rPr>
-          <w:color w:val="1F4D78"/>
-          <w:sz w:val="20"/>
-        </w:rPr>
-        <w:t>the effective</w:t>
-      </w:r>
-      <w:proofErr w:type="gramEnd"/>
-      <w:r>
-        <w:rPr>
-          <w:color w:val="1F4D78"/>
-          <w:sz w:val="20"/>
-        </w:rPr>
-        <w:t xml:space="preserve"> Chat behavior after central access approval. Every action is rechecked against the target conversation, current active memberships, and current package-role assignments.</w:t>
+        <w:t>This matrix describes the effective Chat behavior after central access approval. Every action is rechecked against the target conversation, current active memberships, and current package-role assignments.</w:t>
       </w:r>
     </w:p>
     <w:p>
@@ -264,23 +262,7 @@
                 <w:color w:val="1F4D78"/>
                 <w:sz w:val="20"/>
               </w:rPr>
-              <w:t>‘</w:t>
-            </w:r>
-            <w:r>
-              <w:rPr>
-                <w:b/>
-                <w:color w:val="1F4D78"/>
-                <w:sz w:val="20"/>
-              </w:rPr>
-              <w:t xml:space="preserve">CONVERSATION MANAGEMENT’ </w:t>
-            </w:r>
-            <w:r>
-              <w:rPr>
-                <w:b/>
-                <w:color w:val="1F4D78"/>
-                <w:sz w:val="20"/>
-              </w:rPr>
-              <w:t>page</w:t>
+              <w:t>‘CONVERSATION MANAGEMENT’ page</w:t>
             </w:r>
           </w:p>
         </w:tc>
@@ -848,7 +830,7 @@
                 <w:color w:val="1F4D78"/>
                 <w:sz w:val="20"/>
               </w:rPr>
-              <w:t xml:space="preserve"> </w:t>
+              <w:t xml:space="preserve"> CATEGORY</w:t>
             </w:r>
             <w:r>
               <w:rPr>
@@ -856,7 +838,7 @@
                 <w:color w:val="1F4D78"/>
                 <w:sz w:val="20"/>
               </w:rPr>
-              <w:t>CATEGORY</w:t>
+              <w:t xml:space="preserve"> </w:t>
             </w:r>
             <w:r>
               <w:rPr>
@@ -864,23 +846,7 @@
                 <w:color w:val="1F4D78"/>
                 <w:sz w:val="20"/>
               </w:rPr>
-              <w:t xml:space="preserve"> </w:t>
-            </w:r>
-            <w:r>
-              <w:rPr>
-                <w:b/>
-                <w:color w:val="1F4D78"/>
-                <w:sz w:val="20"/>
-              </w:rPr>
-              <w:t xml:space="preserve">IN </w:t>
-            </w:r>
-            <w:r>
-              <w:rPr>
-                <w:b/>
-                <w:color w:val="1F4D78"/>
-                <w:sz w:val="20"/>
-              </w:rPr>
-              <w:t>ORGANIZATION</w:t>
+              <w:t>IN ORGANIZATION</w:t>
             </w:r>
           </w:p>
         </w:tc>
@@ -946,14 +912,7 @@
                 <w:sz w:val="20"/>
                 <w:lang w:val="en-CA"/>
               </w:rPr>
-              <w:t xml:space="preserve">; only </w:t>
-            </w:r>
-            <w:r>
-              <w:rPr>
-                <w:sz w:val="20"/>
-                <w:lang w:val="en-CA"/>
-              </w:rPr>
-              <w:t>in the data scope of selected organization</w:t>
+              <w:t>; only in the data scope of selected organization</w:t>
             </w:r>
             <w:r>
               <w:rPr>
@@ -1019,14 +978,7 @@
                 <w:sz w:val="20"/>
                 <w:lang w:val="en-CA"/>
               </w:rPr>
-              <w:t xml:space="preserve"> </w:t>
-            </w:r>
-            <w:r>
-              <w:rPr>
-                <w:sz w:val="20"/>
-                <w:lang w:val="en-CA"/>
-              </w:rPr>
-              <w:t>in the data scope of selected organization</w:t>
+              <w:t xml:space="preserve"> in the data scope of selected organization</w:t>
             </w:r>
             <w:r>
               <w:rPr>
@@ -1592,19 +1544,11 @@
                 <w:sz w:val="20"/>
               </w:rPr>
             </w:pPr>
-            <w:proofErr w:type="gramStart"/>
-            <w:r>
-              <w:rPr>
-                <w:sz w:val="20"/>
-              </w:rPr>
-              <w:t>Can</w:t>
-            </w:r>
-            <w:proofErr w:type="gramEnd"/>
-            <w:r>
-              <w:rPr>
-                <w:sz w:val="20"/>
-              </w:rPr>
-              <w:t xml:space="preserve"> see the Chat inbox and full </w:t>
+            <w:r>
+              <w:rPr>
+                <w:sz w:val="20"/>
+              </w:rPr>
+              <w:t xml:space="preserve">Can see the Chat inbox and full </w:t>
             </w:r>
             <w:r>
               <w:rPr>
@@ -1641,13 +1585,7 @@
               <w:rPr>
                 <w:sz w:val="20"/>
               </w:rPr>
-              <w:t xml:space="preserve">, </w:t>
-            </w:r>
-            <w:r>
-              <w:rPr>
-                <w:sz w:val="20"/>
-              </w:rPr>
-              <w:t>message text</w:t>
+              <w:t>, message text</w:t>
             </w:r>
             <w:r>
               <w:rPr>
@@ -1659,21 +1597,7 @@
               <w:rPr>
                 <w:sz w:val="20"/>
               </w:rPr>
-              <w:t xml:space="preserve">, </w:t>
-            </w:r>
-            <w:proofErr w:type="gramStart"/>
-            <w:r>
-              <w:rPr>
-                <w:sz w:val="20"/>
-              </w:rPr>
-              <w:t>reply</w:t>
-            </w:r>
-            <w:proofErr w:type="gramEnd"/>
-            <w:r>
-              <w:rPr>
-                <w:sz w:val="20"/>
-              </w:rPr>
-              <w:t xml:space="preserve"> previews, and active attachments in those conversations.</w:t>
+              <w:t>, reply previews, and active attachments in those conversations.</w:t>
             </w:r>
           </w:p>
           <w:p>
@@ -1939,40 +1863,18 @@
                 <w:sz w:val="20"/>
               </w:rPr>
             </w:pPr>
-            <w:proofErr w:type="gramStart"/>
-            <w:r>
-              <w:rPr>
-                <w:sz w:val="20"/>
-              </w:rPr>
-              <w:t>Can</w:t>
-            </w:r>
-            <w:proofErr w:type="gramEnd"/>
-            <w:r>
-              <w:rPr>
-                <w:sz w:val="20"/>
-              </w:rPr>
-              <w:t xml:space="preserve"> see the Chat inbox and full conversation history only for conversations where the user is a participant. This operation alone does not allow:</w:t>
+            <w:r>
+              <w:rPr>
+                <w:sz w:val="20"/>
+              </w:rPr>
+              <w:t>Can see the Chat inbox and full conversation history only for conversations where the user is a participant. This operation alone does not allow:</w:t>
             </w:r>
             <w:r>
               <w:rPr>
                 <w:sz w:val="20"/>
               </w:rPr>
               <w:br/>
-              <w:t xml:space="preserve">- to see the messaging history, message texts, </w:t>
-            </w:r>
-            <w:proofErr w:type="gramStart"/>
-            <w:r>
-              <w:rPr>
-                <w:sz w:val="20"/>
-              </w:rPr>
-              <w:t>reply</w:t>
-            </w:r>
-            <w:proofErr w:type="gramEnd"/>
-            <w:r>
-              <w:rPr>
-                <w:sz w:val="20"/>
-              </w:rPr>
-              <w:t xml:space="preserve"> previews, and active attachments in those conversations.</w:t>
+              <w:t>- to see the messaging history, message texts, reply previews, and active attachments in those conversations.</w:t>
             </w:r>
           </w:p>
           <w:p>
@@ -2226,40 +2128,18 @@
                 <w:sz w:val="20"/>
               </w:rPr>
             </w:pPr>
-            <w:proofErr w:type="gramStart"/>
-            <w:r>
-              <w:rPr>
-                <w:sz w:val="20"/>
-              </w:rPr>
-              <w:t>Can</w:t>
-            </w:r>
-            <w:proofErr w:type="gramEnd"/>
-            <w:r>
-              <w:rPr>
-                <w:sz w:val="20"/>
-              </w:rPr>
-              <w:t xml:space="preserve"> see the Chat inbox and full conversation history only for conversations where the user is a participant. This operation alone does not allow:</w:t>
+            <w:r>
+              <w:rPr>
+                <w:sz w:val="20"/>
+              </w:rPr>
+              <w:t>Can see the Chat inbox and full conversation history only for conversations where the user is a participant. This operation alone does not allow:</w:t>
             </w:r>
             <w:r>
               <w:rPr>
                 <w:sz w:val="20"/>
               </w:rPr>
               <w:br/>
-              <w:t xml:space="preserve">- to see the messaging history, message texts, </w:t>
-            </w:r>
-            <w:proofErr w:type="gramStart"/>
-            <w:r>
-              <w:rPr>
-                <w:sz w:val="20"/>
-              </w:rPr>
-              <w:t>reply</w:t>
-            </w:r>
-            <w:proofErr w:type="gramEnd"/>
-            <w:r>
-              <w:rPr>
-                <w:sz w:val="20"/>
-              </w:rPr>
-              <w:t xml:space="preserve"> previews, and active attachments in those conversations.</w:t>
+              <w:t>- to see the messaging history, message texts, reply previews, and active attachments in those conversations.</w:t>
             </w:r>
           </w:p>
           <w:p>
@@ -2602,23 +2482,7 @@
                 <w:sz w:val="20"/>
                 <w:lang w:val="en-CA"/>
               </w:rPr>
-              <w:t xml:space="preserve">Users with the appropriate permissions can view the complete message history of conversations in which they are participants. This includes message content, </w:t>
-            </w:r>
-            <w:proofErr w:type="gramStart"/>
-            <w:r>
-              <w:rPr>
-                <w:sz w:val="20"/>
-                <w:lang w:val="en-CA"/>
-              </w:rPr>
-              <w:t>reply</w:t>
-            </w:r>
-            <w:proofErr w:type="gramEnd"/>
-            <w:r>
-              <w:rPr>
-                <w:sz w:val="20"/>
-                <w:lang w:val="en-CA"/>
-              </w:rPr>
-              <w:t xml:space="preserve"> previews, and active attachments associated with those conversations.</w:t>
+              <w:t>Users with the appropriate permissions can view the complete message history of conversations in which they are participants. This includes message content, reply previews, and active attachments associated with those conversations.</w:t>
             </w:r>
           </w:p>
           <w:p>
@@ -2926,23 +2790,7 @@
                 <w:sz w:val="20"/>
                 <w:lang w:val="en-CA"/>
               </w:rPr>
-              <w:t xml:space="preserve">Users with the appropriate permissions can view the complete message history of conversations in which they are participants. This includes message content, </w:t>
-            </w:r>
-            <w:proofErr w:type="gramStart"/>
-            <w:r>
-              <w:rPr>
-                <w:sz w:val="20"/>
-                <w:lang w:val="en-CA"/>
-              </w:rPr>
-              <w:t>reply</w:t>
-            </w:r>
-            <w:proofErr w:type="gramEnd"/>
-            <w:r>
-              <w:rPr>
-                <w:sz w:val="20"/>
-                <w:lang w:val="en-CA"/>
-              </w:rPr>
-              <w:t xml:space="preserve"> previews, and active attachments associated with those conversations.</w:t>
+              <w:t>Users with the appropriate permissions can view the complete message history of conversations in which they are participants. This includes message content, reply previews, and active attachments associated with those conversations.</w:t>
             </w:r>
           </w:p>
         </w:tc>
@@ -3039,19 +2887,11 @@
             <w:pPr>
               <w:spacing w:after="0" w:line="269" w:lineRule="auto"/>
             </w:pPr>
-            <w:proofErr w:type="gramStart"/>
-            <w:r>
-              <w:rPr>
-                <w:sz w:val="20"/>
-              </w:rPr>
-              <w:t>Can</w:t>
-            </w:r>
-            <w:proofErr w:type="gramEnd"/>
-            <w:r>
-              <w:rPr>
-                <w:sz w:val="20"/>
-              </w:rPr>
-              <w:t xml:space="preserve"> see </w:t>
+            <w:r>
+              <w:rPr>
+                <w:sz w:val="20"/>
+              </w:rPr>
+              <w:t xml:space="preserve">Can see </w:t>
             </w:r>
             <w:r>
               <w:rPr>
@@ -3064,21 +2904,7 @@
               <w:rPr>
                 <w:sz w:val="20"/>
               </w:rPr>
-              <w:t xml:space="preserve">of all users within the </w:t>
-            </w:r>
-            <w:proofErr w:type="gramStart"/>
-            <w:r>
-              <w:rPr>
-                <w:sz w:val="20"/>
-              </w:rPr>
-              <w:t>packages</w:t>
-            </w:r>
-            <w:proofErr w:type="gramEnd"/>
-            <w:r>
-              <w:rPr>
-                <w:sz w:val="20"/>
-              </w:rPr>
-              <w:t xml:space="preserve"> that user has active roles.</w:t>
+              <w:t>of all users within the packages that user has active roles.</w:t>
             </w:r>
           </w:p>
         </w:tc>
@@ -3214,23 +3040,7 @@
                 <w:sz w:val="20"/>
                 <w:lang w:val="en-CA"/>
               </w:rPr>
-              <w:t xml:space="preserve">Users with the appropriate permissions can view the complete message history of conversations in which they are participants. This includes message content, </w:t>
-            </w:r>
-            <w:proofErr w:type="gramStart"/>
-            <w:r>
-              <w:rPr>
-                <w:sz w:val="20"/>
-                <w:lang w:val="en-CA"/>
-              </w:rPr>
-              <w:t>reply</w:t>
-            </w:r>
-            <w:proofErr w:type="gramEnd"/>
-            <w:r>
-              <w:rPr>
-                <w:sz w:val="20"/>
-                <w:lang w:val="en-CA"/>
-              </w:rPr>
-              <w:t xml:space="preserve"> previews, and active attachments associated with those conversations.</w:t>
+              <w:t>Users with the appropriate permissions can view the complete message history of conversations in which they are participants. This includes message content, reply previews, and active attachments associated with those conversations.</w:t>
             </w:r>
           </w:p>
           <w:p>
@@ -3449,14 +3259,7 @@
                 <w:bCs/>
                 <w:sz w:val="20"/>
               </w:rPr>
-              <w:t xml:space="preserve">: </w:t>
-            </w:r>
-            <w:r>
-              <w:rPr>
-                <w:bCs/>
-                <w:sz w:val="20"/>
-              </w:rPr>
-              <w:t>To view a list of conversations they participate in, users must have READ access. To view the details of those conversations, including messages, attachments, and replies, users must have READ_ALL access.</w:t>
+              <w:t>: To view a list of conversations they participate in, users must have READ access. To view the details of those conversations, including messages, attachments, and replies, users must have READ_ALL access.</w:t>
             </w:r>
           </w:p>
         </w:tc>
@@ -3690,57 +3493,11 @@
                 <w:sz w:val="20"/>
               </w:rPr>
             </w:pPr>
-            <w:proofErr w:type="gramStart"/>
-            <w:r>
-              <w:rPr>
-                <w:sz w:val="20"/>
-              </w:rPr>
-              <w:t>Can</w:t>
-            </w:r>
-            <w:proofErr w:type="gramEnd"/>
-            <w:r>
-              <w:rPr>
-                <w:sz w:val="20"/>
-              </w:rPr>
-              <w:t xml:space="preserve"> search </w:t>
-            </w:r>
-            <w:r>
-              <w:rPr>
-                <w:sz w:val="20"/>
-              </w:rPr>
-              <w:t xml:space="preserve">for </w:t>
-            </w:r>
-            <w:r>
-              <w:rPr>
-                <w:sz w:val="20"/>
-              </w:rPr>
-              <w:t xml:space="preserve">and see eligible contacts under the standard contact policy: active users in the same </w:t>
-            </w:r>
-            <w:proofErr w:type="gramStart"/>
-            <w:r>
-              <w:rPr>
-                <w:sz w:val="20"/>
-              </w:rPr>
-              <w:t>organization who</w:t>
-            </w:r>
-            <w:proofErr w:type="gramEnd"/>
-            <w:r>
-              <w:rPr>
-                <w:sz w:val="20"/>
-              </w:rPr>
-              <w:t xml:space="preserve"> share a recognized package </w:t>
-            </w:r>
-            <w:r>
-              <w:rPr>
-                <w:sz w:val="20"/>
-              </w:rPr>
-              <w:t>role</w:t>
-            </w:r>
-            <w:r>
-              <w:rPr>
-                <w:sz w:val="20"/>
-              </w:rPr>
-              <w:t>. Can start a direct chat. Cannot start a chat with self or see unrelated users.</w:t>
+            <w:r>
+              <w:rPr>
+                <w:sz w:val="20"/>
+              </w:rPr>
+              <w:t>Can search for and see eligible contacts under the standard contact policy: active users in the same organization who share a recognized package role. Can start a direct chat. Cannot start a chat with self or see unrelated users.</w:t>
             </w:r>
           </w:p>
           <w:p>
@@ -4019,31 +3776,7 @@
               <w:rPr>
                 <w:sz w:val="20"/>
               </w:rPr>
-              <w:t xml:space="preserve">Can </w:t>
-            </w:r>
-            <w:r>
-              <w:rPr>
-                <w:sz w:val="20"/>
-              </w:rPr>
-              <w:t>search for</w:t>
-            </w:r>
-            <w:r>
-              <w:rPr>
-                <w:sz w:val="20"/>
-              </w:rPr>
-              <w:t xml:space="preserve"> and see eligible contacts under the standard contact policy: </w:t>
-            </w:r>
-            <w:r>
-              <w:rPr>
-                <w:sz w:val="20"/>
-              </w:rPr>
-              <w:t xml:space="preserve">all </w:t>
-            </w:r>
-            <w:r>
-              <w:rPr>
-                <w:sz w:val="20"/>
-              </w:rPr>
-              <w:t>active users in the same organization. Can start a direct chat. Cannot start a chat with self or see unrelated users.</w:t>
+              <w:t>Can search for and see eligible contacts under the standard contact policy: all active users in the same organization. Can start a direct chat. Cannot start a chat with self or see unrelated users.</w:t>
             </w:r>
           </w:p>
         </w:tc>
@@ -4204,23 +3937,7 @@
                 <w:bCs/>
                 <w:sz w:val="20"/>
               </w:rPr>
-              <w:t xml:space="preserve">If READ_ALL access (Not USER scope) </w:t>
-            </w:r>
-            <w:proofErr w:type="gramStart"/>
-            <w:r>
-              <w:rPr>
-                <w:bCs/>
-                <w:sz w:val="20"/>
-              </w:rPr>
-              <w:t>is granted</w:t>
-            </w:r>
-            <w:proofErr w:type="gramEnd"/>
-            <w:r>
-              <w:rPr>
-                <w:bCs/>
-                <w:sz w:val="20"/>
-              </w:rPr>
-              <w:t>, it can s</w:t>
+              <w:t>If READ_ALL access (Not USER scope) is granted, it can s</w:t>
             </w:r>
             <w:r>
               <w:rPr>
@@ -4244,23 +3961,7 @@
                 <w:bCs/>
                 <w:sz w:val="20"/>
               </w:rPr>
-              <w:t xml:space="preserve">If READ_ALL access </w:t>
-            </w:r>
-            <w:proofErr w:type="gramStart"/>
-            <w:r>
-              <w:rPr>
-                <w:bCs/>
-                <w:sz w:val="20"/>
-              </w:rPr>
-              <w:t>is not granted</w:t>
-            </w:r>
-            <w:proofErr w:type="gramEnd"/>
-            <w:r>
-              <w:rPr>
-                <w:bCs/>
-                <w:sz w:val="20"/>
-              </w:rPr>
-              <w:t xml:space="preserve"> or its scope is not appropriate, it cannot see the messaging history in the chat.</w:t>
+              <w:t>If READ_ALL access is not granted or its scope is not appropriate, it cannot see the messaging history in the chat.</w:t>
             </w:r>
           </w:p>
           <w:p>
@@ -4321,44 +4022,14 @@
                 <w:bCs/>
                 <w:sz w:val="20"/>
               </w:rPr>
-              <w:t xml:space="preserve">READ_ALL access </w:t>
-            </w:r>
-            <w:proofErr w:type="gramStart"/>
+              <w:t>READ_ALL access is granted, it can s</w:t>
+            </w:r>
             <w:r>
               <w:rPr>
                 <w:bCs/>
                 <w:sz w:val="20"/>
               </w:rPr>
-              <w:t>is granted</w:t>
-            </w:r>
-            <w:proofErr w:type="gramEnd"/>
-            <w:r>
-              <w:rPr>
-                <w:bCs/>
-                <w:sz w:val="20"/>
-              </w:rPr>
-              <w:t>, it can s</w:t>
-            </w:r>
-            <w:r>
-              <w:rPr>
-                <w:bCs/>
-                <w:sz w:val="20"/>
-              </w:rPr>
-              <w:t xml:space="preserve">ee the </w:t>
-            </w:r>
-            <w:r>
-              <w:rPr>
-                <w:bCs/>
-                <w:sz w:val="20"/>
-              </w:rPr>
-              <w:t xml:space="preserve">conversation body in the </w:t>
-            </w:r>
-            <w:r>
-              <w:rPr>
-                <w:bCs/>
-                <w:sz w:val="20"/>
-              </w:rPr>
-              <w:t>chat modal.</w:t>
+              <w:t>ee the conversation body in the chat modal.</w:t>
             </w:r>
           </w:p>
           <w:p>
@@ -4375,44 +4046,7 @@
                 <w:bCs/>
                 <w:sz w:val="20"/>
               </w:rPr>
-              <w:t xml:space="preserve">If READ_ALL access </w:t>
-            </w:r>
-            <w:proofErr w:type="gramStart"/>
-            <w:r>
-              <w:rPr>
-                <w:bCs/>
-                <w:sz w:val="20"/>
-              </w:rPr>
-              <w:t>is not granted</w:t>
-            </w:r>
-            <w:proofErr w:type="gramEnd"/>
-            <w:r>
-              <w:rPr>
-                <w:bCs/>
-                <w:sz w:val="20"/>
-              </w:rPr>
-              <w:t xml:space="preserve"> or its scope is not appropriate, it cannot see the </w:t>
-            </w:r>
-            <w:r>
-              <w:rPr>
-                <w:bCs/>
-                <w:sz w:val="20"/>
-              </w:rPr>
-              <w:t xml:space="preserve">conversation body </w:t>
-            </w:r>
-            <w:r>
-              <w:rPr>
-                <w:bCs/>
-                <w:sz w:val="20"/>
-              </w:rPr>
-              <w:t>in the chat</w:t>
-            </w:r>
-            <w:r>
-              <w:rPr>
-                <w:bCs/>
-                <w:sz w:val="20"/>
-              </w:rPr>
-              <w:t xml:space="preserve"> modal.</w:t>
+              <w:t>If READ_ALL access is not granted or its scope is not appropriate, it cannot see the conversation body in the chat modal.</w:t>
             </w:r>
           </w:p>
         </w:tc>
@@ -4690,19 +4324,11 @@
                 <w:sz w:val="20"/>
               </w:rPr>
             </w:pPr>
-            <w:proofErr w:type="gramStart"/>
-            <w:r>
-              <w:rPr>
-                <w:sz w:val="20"/>
-              </w:rPr>
-              <w:t>15</w:t>
-            </w:r>
-            <w:proofErr w:type="gramEnd"/>
-            <w:r>
-              <w:rPr>
-                <w:sz w:val="20"/>
-              </w:rPr>
-              <w:t xml:space="preserve"> messages including </w:t>
+            <w:r>
+              <w:rPr>
+                <w:sz w:val="20"/>
+              </w:rPr>
+              <w:t xml:space="preserve">15 messages including </w:t>
             </w:r>
             <w:r>
               <w:rPr>
@@ -4839,14 +4465,7 @@
                 <w:b/>
                 <w:sz w:val="20"/>
               </w:rPr>
-              <w:t xml:space="preserve">/ </w:t>
-            </w:r>
-            <w:r>
-              <w:rPr>
-                <w:b/>
-                <w:sz w:val="20"/>
-              </w:rPr>
-              <w:t>DIVISION</w:t>
+              <w:t>/ DIVISION</w:t>
             </w:r>
           </w:p>
         </w:tc>
@@ -4960,31 +4579,17 @@
               </w:numPr>
               <w:spacing w:after="0" w:line="269" w:lineRule="auto"/>
             </w:pPr>
-            <w:proofErr w:type="gramStart"/>
             <w:r>
               <w:rPr>
                 <w:sz w:val="20"/>
               </w:rPr>
               <w:t>100</w:t>
             </w:r>
-            <w:proofErr w:type="gramEnd"/>
-            <w:r>
-              <w:rPr>
-                <w:sz w:val="20"/>
-              </w:rPr>
-              <w:t xml:space="preserve"> messages including text messages, attachments, and replies in text or </w:t>
-            </w:r>
-            <w:r>
-              <w:rPr>
-                <w:sz w:val="20"/>
-              </w:rPr>
-              <w:t>files</w:t>
-            </w:r>
-            <w:r>
-              <w:rPr>
-                <w:sz w:val="20"/>
-              </w:rPr>
-              <w:t>.</w:t>
+            <w:r>
+              <w:rPr>
+                <w:sz w:val="20"/>
+              </w:rPr>
+              <w:t xml:space="preserve"> messages including text messages, attachments, and replies in text or files.</w:t>
             </w:r>
           </w:p>
           <w:p>
@@ -5089,14 +4694,7 @@
                 <w:b/>
                 <w:sz w:val="20"/>
               </w:rPr>
-              <w:t xml:space="preserve">ORGANIZATION/ </w:t>
-            </w:r>
-            <w:r>
-              <w:rPr>
-                <w:b/>
-                <w:sz w:val="20"/>
-              </w:rPr>
-              <w:t>ADMIN</w:t>
+              <w:t>ORGANIZATION/ ADMIN</w:t>
             </w:r>
           </w:p>
         </w:tc>
@@ -5475,35 +5073,19 @@
               <w:rPr>
                 <w:sz w:val="20"/>
               </w:rPr>
-              <w:t xml:space="preserve">Can view inline images or download files only when DOWNLOAD_FILE </w:t>
-            </w:r>
-            <w:proofErr w:type="gramStart"/>
-            <w:r>
-              <w:rPr>
-                <w:sz w:val="20"/>
-              </w:rPr>
-              <w:t>is granted</w:t>
-            </w:r>
-            <w:proofErr w:type="gramEnd"/>
-            <w:r>
-              <w:rPr>
-                <w:sz w:val="20"/>
-              </w:rPr>
-              <w:t xml:space="preserve"> and the user can read the conversation. The message must be active and still reference the file. A deleted message's file cannot </w:t>
-            </w:r>
-            <w:proofErr w:type="gramStart"/>
-            <w:r>
-              <w:rPr>
-                <w:sz w:val="20"/>
-              </w:rPr>
-              <w:t>be downloaded</w:t>
-            </w:r>
-            <w:proofErr w:type="gramEnd"/>
-            <w:r>
-              <w:rPr>
-                <w:sz w:val="20"/>
-              </w:rPr>
-              <w:t>, even through a saved URL. This scope does not independently broaden conversation visibility.</w:t>
+              <w:t xml:space="preserve">Can view inline images or download files only when DOWNLOAD_FILE is granted and the user can read the conversation. The message must be active and still reference the file. A deleted message's file cannot be downloaded, even </w:t>
+            </w:r>
+            <w:r>
+              <w:rPr>
+                <w:sz w:val="20"/>
+              </w:rPr>
+              <w:t>though</w:t>
+            </w:r>
+            <w:r>
+              <w:rPr>
+                <w:sz w:val="20"/>
+              </w:rPr>
+              <w:t xml:space="preserve"> a saved URL. This scope does not independently broaden conversation visibility.</w:t>
             </w:r>
           </w:p>
         </w:tc>
@@ -5598,9 +5180,13 @@
         </w:tc>
       </w:tr>
       <w:tr>
+        <w:trPr>
+          <w:trHeight w:val="628"/>
+        </w:trPr>
         <w:tc>
           <w:tcPr>
             <w:tcW w:w="1440" w:type="dxa"/>
+            <w:vMerge w:val="restart"/>
             <w:tcMar>
               <w:top w:w="80" w:type="dxa"/>
               <w:left w:w="120" w:type="dxa"/>
@@ -5626,6 +5212,7 @@
         <w:tc>
           <w:tcPr>
             <w:tcW w:w="1656" w:type="dxa"/>
+            <w:vMerge w:val="restart"/>
             <w:tcMar>
               <w:top w:w="80" w:type="dxa"/>
               <w:left w:w="120" w:type="dxa"/>
@@ -5710,33 +5297,117 @@
             <w:pPr>
               <w:spacing w:after="0" w:line="269" w:lineRule="auto"/>
             </w:pPr>
-            <w:proofErr w:type="gramStart"/>
-            <w:r>
-              <w:rPr>
-                <w:sz w:val="20"/>
-              </w:rPr>
-              <w:t>Can</w:t>
-            </w:r>
-            <w:proofErr w:type="gramEnd"/>
-            <w:r>
-              <w:rPr>
-                <w:sz w:val="20"/>
-              </w:rPr>
-              <w:t xml:space="preserve"> select and soft-delete only messages authored by the user. </w:t>
-            </w:r>
-            <w:proofErr w:type="gramStart"/>
-            <w:r>
-              <w:rPr>
-                <w:sz w:val="20"/>
-              </w:rPr>
-              <w:t>Can</w:t>
-            </w:r>
-            <w:proofErr w:type="gramEnd"/>
-            <w:r>
-              <w:rPr>
-                <w:sz w:val="20"/>
-              </w:rPr>
-              <w:t xml:space="preserve"> use single or bulk deletion only when every selected message is their own. Cannot delete another participant's message or the whole conversation.</w:t>
+            <w:r>
+              <w:rPr>
+                <w:sz w:val="20"/>
+              </w:rPr>
+              <w:t>Can select and soft-delete only messages authored by the user. Can use single or bulk deletion only when every selected message is their own. Cannot delete another participant's message or the whole conversation. Deleted messages are only from their side and the other side can still see the messages.</w:t>
+            </w:r>
+          </w:p>
+        </w:tc>
+      </w:tr>
+      <w:tr>
+        <w:trPr>
+          <w:trHeight w:val="628"/>
+        </w:trPr>
+        <w:tc>
+          <w:tcPr>
+            <w:tcW w:w="1440" w:type="dxa"/>
+            <w:vMerge/>
+            <w:tcMar>
+              <w:top w:w="80" w:type="dxa"/>
+              <w:left w:w="120" w:type="dxa"/>
+              <w:bottom w:w="80" w:type="dxa"/>
+              <w:right w:w="120" w:type="dxa"/>
+            </w:tcMar>
+            <w:vAlign w:val="center"/>
+          </w:tcPr>
+          <w:p>
+            <w:pPr>
+              <w:spacing w:after="0" w:line="269" w:lineRule="auto"/>
+              <w:rPr>
+                <w:b/>
+                <w:color w:val="1F4D78"/>
+                <w:sz w:val="20"/>
+              </w:rPr>
+            </w:pPr>
+          </w:p>
+        </w:tc>
+        <w:tc>
+          <w:tcPr>
+            <w:tcW w:w="1656" w:type="dxa"/>
+            <w:vMerge/>
+            <w:tcMar>
+              <w:top w:w="80" w:type="dxa"/>
+              <w:left w:w="120" w:type="dxa"/>
+              <w:bottom w:w="80" w:type="dxa"/>
+              <w:right w:w="120" w:type="dxa"/>
+            </w:tcMar>
+            <w:vAlign w:val="center"/>
+          </w:tcPr>
+          <w:p>
+            <w:pPr>
+              <w:spacing w:after="0" w:line="269" w:lineRule="auto"/>
+              <w:rPr>
+                <w:b/>
+                <w:sz w:val="20"/>
+              </w:rPr>
+            </w:pPr>
+          </w:p>
+        </w:tc>
+        <w:tc>
+          <w:tcPr>
+            <w:tcW w:w="6264" w:type="dxa"/>
+            <w:tcMar>
+              <w:top w:w="80" w:type="dxa"/>
+              <w:left w:w="120" w:type="dxa"/>
+              <w:bottom w:w="80" w:type="dxa"/>
+              <w:right w:w="120" w:type="dxa"/>
+            </w:tcMar>
+            <w:vAlign w:val="center"/>
+          </w:tcPr>
+          <w:p>
+            <w:pPr>
+              <w:spacing w:after="0" w:line="269" w:lineRule="auto"/>
+              <w:rPr>
+                <w:sz w:val="20"/>
+              </w:rPr>
+            </w:pPr>
+            <w:r>
+              <w:rPr>
+                <w:sz w:val="20"/>
+              </w:rPr>
+              <w:t>On ‘</w:t>
+            </w:r>
+            <w:r>
+              <w:rPr>
+                <w:b/>
+                <w:bCs/>
+                <w:sz w:val="20"/>
+              </w:rPr>
+              <w:t>Conversation Management</w:t>
+            </w:r>
+            <w:r>
+              <w:rPr>
+                <w:sz w:val="20"/>
+              </w:rPr>
+              <w:t xml:space="preserve">’ page: </w:t>
+            </w:r>
+          </w:p>
+          <w:p>
+            <w:pPr>
+              <w:spacing w:after="0" w:line="269" w:lineRule="auto"/>
+              <w:rPr>
+                <w:sz w:val="20"/>
+                <w:lang w:val="en-CA"/>
+              </w:rPr>
+            </w:pPr>
+            <w:r>
+              <w:rPr>
+                <w:sz w:val="20"/>
+                <w:lang w:val="en-CA"/>
+              </w:rPr>
+              <w:t>No Delete Access.</w:t>
             </w:r>
           </w:p>
         </w:tc>
@@ -5819,12 +5490,84 @@
           <w:p>
             <w:pPr>
               <w:spacing w:after="0" w:line="269" w:lineRule="auto"/>
-            </w:pPr>
-            <w:r>
-              <w:rPr>
-                <w:sz w:val="20"/>
-              </w:rPr>
-              <w:t>Can delete either participant's messages, including mixed multi-select, only when every conversation participant shares at least one recognized package domain with the user. Can delete the whole conversation under the same all-participants rule.</w:t>
+              <w:rPr>
+                <w:sz w:val="20"/>
+                <w:lang w:val="en-CA"/>
+              </w:rPr>
+            </w:pPr>
+            <w:r>
+              <w:rPr>
+                <w:sz w:val="20"/>
+                <w:lang w:val="en-CA"/>
+              </w:rPr>
+              <w:t xml:space="preserve">On the </w:t>
+            </w:r>
+            <w:r>
+              <w:rPr>
+                <w:sz w:val="20"/>
+                <w:lang w:val="en-CA"/>
+              </w:rPr>
+              <w:t>‘</w:t>
+            </w:r>
+            <w:r>
+              <w:rPr>
+                <w:b/>
+                <w:bCs/>
+                <w:sz w:val="20"/>
+                <w:lang w:val="en-CA"/>
+              </w:rPr>
+              <w:t>Chat</w:t>
+            </w:r>
+            <w:r>
+              <w:rPr>
+                <w:b/>
+                <w:bCs/>
+                <w:sz w:val="20"/>
+                <w:lang w:val="en-CA"/>
+              </w:rPr>
+              <w:t>’</w:t>
+            </w:r>
+            <w:r>
+              <w:rPr>
+                <w:sz w:val="20"/>
+                <w:lang w:val="en-CA"/>
+              </w:rPr>
+              <w:t xml:space="preserve"> modal:</w:t>
+            </w:r>
+          </w:p>
+          <w:p>
+            <w:pPr>
+              <w:spacing w:after="0" w:line="269" w:lineRule="auto"/>
+            </w:pPr>
+            <w:r>
+              <w:rPr>
+                <w:sz w:val="20"/>
+              </w:rPr>
+              <w:t xml:space="preserve">Can delete either participant's messages, including mixed multi-select, only </w:t>
+            </w:r>
+            <w:r>
+              <w:rPr>
+                <w:sz w:val="20"/>
+              </w:rPr>
+              <w:t>in conversations where the user is</w:t>
+            </w:r>
+            <w:r>
+              <w:rPr>
+                <w:sz w:val="20"/>
+              </w:rPr>
+              <w:t xml:space="preserve"> participant.</w:t>
+            </w:r>
+            <w:r>
+              <w:rPr>
+                <w:sz w:val="20"/>
+              </w:rPr>
+              <w:t xml:space="preserve"> </w:t>
+            </w:r>
+            <w:r>
+              <w:rPr>
+                <w:sz w:val="20"/>
+              </w:rPr>
+              <w:t>Deleted messages are only from their side and the other side can still see the messages.</w:t>
             </w:r>
           </w:p>
         </w:tc>
@@ -5880,12 +5623,386 @@
           <w:p>
             <w:pPr>
               <w:spacing w:after="0" w:line="269" w:lineRule="auto"/>
-            </w:pPr>
-            <w:r>
-              <w:rPr>
-                <w:sz w:val="20"/>
-              </w:rPr>
-              <w:t>Can delete either participant's messages, including mixed multi-select, only when every conversation participant shares one exact recognized package role with the user. Can delete the whole conversation under the same all-participants rule.</w:t>
+              <w:rPr>
+                <w:sz w:val="20"/>
+              </w:rPr>
+            </w:pPr>
+            <w:r>
+              <w:rPr>
+                <w:sz w:val="20"/>
+              </w:rPr>
+              <w:t>On ‘</w:t>
+            </w:r>
+            <w:r>
+              <w:rPr>
+                <w:b/>
+                <w:bCs/>
+                <w:sz w:val="20"/>
+              </w:rPr>
+              <w:t>Conversation Management</w:t>
+            </w:r>
+            <w:r>
+              <w:rPr>
+                <w:sz w:val="20"/>
+              </w:rPr>
+              <w:t xml:space="preserve">’ page: </w:t>
+            </w:r>
+          </w:p>
+          <w:p>
+            <w:pPr>
+              <w:spacing w:after="0" w:line="269" w:lineRule="auto"/>
+            </w:pPr>
+            <w:r>
+              <w:rPr>
+                <w:sz w:val="20"/>
+                <w:lang w:val="en-CA"/>
+              </w:rPr>
+              <w:t>No Delete Access.</w:t>
+            </w:r>
+          </w:p>
+        </w:tc>
+      </w:tr>
+      <w:tr>
+        <w:trPr>
+          <w:trHeight w:val="421"/>
+        </w:trPr>
+        <w:tc>
+          <w:tcPr>
+            <w:tcW w:w="1440" w:type="dxa"/>
+            <w:vMerge w:val="restart"/>
+            <w:tcMar>
+              <w:top w:w="80" w:type="dxa"/>
+              <w:left w:w="120" w:type="dxa"/>
+              <w:bottom w:w="80" w:type="dxa"/>
+              <w:right w:w="120" w:type="dxa"/>
+            </w:tcMar>
+            <w:vAlign w:val="center"/>
+          </w:tcPr>
+          <w:p>
+            <w:pPr>
+              <w:spacing w:after="0" w:line="269" w:lineRule="auto"/>
+            </w:pPr>
+            <w:r>
+              <w:rPr>
+                <w:b/>
+                <w:color w:val="1F4D78"/>
+                <w:sz w:val="20"/>
+              </w:rPr>
+              <w:t>DELETE</w:t>
+            </w:r>
+          </w:p>
+        </w:tc>
+        <w:tc>
+          <w:tcPr>
+            <w:tcW w:w="1656" w:type="dxa"/>
+            <w:vMerge w:val="restart"/>
+            <w:tcMar>
+              <w:top w:w="80" w:type="dxa"/>
+              <w:left w:w="120" w:type="dxa"/>
+              <w:bottom w:w="80" w:type="dxa"/>
+              <w:right w:w="120" w:type="dxa"/>
+            </w:tcMar>
+            <w:vAlign w:val="center"/>
+          </w:tcPr>
+          <w:p>
+            <w:pPr>
+              <w:spacing w:after="0" w:line="269" w:lineRule="auto"/>
+              <w:rPr>
+                <w:b/>
+                <w:sz w:val="20"/>
+              </w:rPr>
+            </w:pPr>
+            <w:r>
+              <w:rPr>
+                <w:b/>
+                <w:sz w:val="20"/>
+              </w:rPr>
+              <w:t>ORGANIZATION/</w:t>
+            </w:r>
+          </w:p>
+          <w:p>
+            <w:pPr>
+              <w:spacing w:after="0" w:line="269" w:lineRule="auto"/>
+            </w:pPr>
+            <w:r>
+              <w:rPr>
+                <w:b/>
+                <w:sz w:val="20"/>
+              </w:rPr>
+              <w:t>ADMIN</w:t>
+            </w:r>
+          </w:p>
+        </w:tc>
+        <w:tc>
+          <w:tcPr>
+            <w:tcW w:w="6264" w:type="dxa"/>
+            <w:tcMar>
+              <w:top w:w="80" w:type="dxa"/>
+              <w:left w:w="120" w:type="dxa"/>
+              <w:bottom w:w="80" w:type="dxa"/>
+              <w:right w:w="120" w:type="dxa"/>
+            </w:tcMar>
+            <w:vAlign w:val="center"/>
+          </w:tcPr>
+          <w:p>
+            <w:pPr>
+              <w:spacing w:after="0" w:line="269" w:lineRule="auto"/>
+              <w:rPr>
+                <w:sz w:val="20"/>
+                <w:lang w:val="en-CA"/>
+              </w:rPr>
+            </w:pPr>
+            <w:r>
+              <w:rPr>
+                <w:sz w:val="20"/>
+                <w:lang w:val="en-CA"/>
+              </w:rPr>
+              <w:t xml:space="preserve">On the </w:t>
+            </w:r>
+            <w:r>
+              <w:rPr>
+                <w:sz w:val="20"/>
+                <w:lang w:val="en-CA"/>
+              </w:rPr>
+              <w:t>‘</w:t>
+            </w:r>
+            <w:r>
+              <w:rPr>
+                <w:b/>
+                <w:bCs/>
+                <w:sz w:val="20"/>
+                <w:lang w:val="en-CA"/>
+              </w:rPr>
+              <w:t>Chat</w:t>
+            </w:r>
+            <w:r>
+              <w:rPr>
+                <w:b/>
+                <w:bCs/>
+                <w:sz w:val="20"/>
+                <w:lang w:val="en-CA"/>
+              </w:rPr>
+              <w:t>’</w:t>
+            </w:r>
+            <w:r>
+              <w:rPr>
+                <w:sz w:val="20"/>
+                <w:lang w:val="en-CA"/>
+              </w:rPr>
+              <w:t xml:space="preserve"> modal:</w:t>
+            </w:r>
+          </w:p>
+          <w:p>
+            <w:pPr>
+              <w:spacing w:after="0" w:line="269" w:lineRule="auto"/>
+            </w:pPr>
+            <w:r>
+              <w:rPr>
+                <w:sz w:val="20"/>
+              </w:rPr>
+              <w:t xml:space="preserve">Can delete either participant's messages, including mixed multi-select, only in conversations where the user is participant. Deleted messages </w:t>
+            </w:r>
+            <w:r>
+              <w:rPr>
+                <w:sz w:val="20"/>
+              </w:rPr>
+              <w:t>delete the message for both sides of the conversation.</w:t>
+            </w:r>
+          </w:p>
+        </w:tc>
+      </w:tr>
+      <w:tr>
+        <w:trPr>
+          <w:trHeight w:val="420"/>
+        </w:trPr>
+        <w:tc>
+          <w:tcPr>
+            <w:tcW w:w="1440" w:type="dxa"/>
+            <w:vMerge/>
+            <w:tcMar>
+              <w:top w:w="80" w:type="dxa"/>
+              <w:left w:w="120" w:type="dxa"/>
+              <w:bottom w:w="80" w:type="dxa"/>
+              <w:right w:w="120" w:type="dxa"/>
+            </w:tcMar>
+            <w:vAlign w:val="center"/>
+          </w:tcPr>
+          <w:p>
+            <w:pPr>
+              <w:spacing w:after="0" w:line="269" w:lineRule="auto"/>
+              <w:rPr>
+                <w:b/>
+                <w:color w:val="1F4D78"/>
+                <w:sz w:val="20"/>
+              </w:rPr>
+            </w:pPr>
+          </w:p>
+        </w:tc>
+        <w:tc>
+          <w:tcPr>
+            <w:tcW w:w="1656" w:type="dxa"/>
+            <w:vMerge/>
+            <w:tcMar>
+              <w:top w:w="80" w:type="dxa"/>
+              <w:left w:w="120" w:type="dxa"/>
+              <w:bottom w:w="80" w:type="dxa"/>
+              <w:right w:w="120" w:type="dxa"/>
+            </w:tcMar>
+            <w:vAlign w:val="center"/>
+          </w:tcPr>
+          <w:p>
+            <w:pPr>
+              <w:spacing w:after="0" w:line="269" w:lineRule="auto"/>
+              <w:rPr>
+                <w:b/>
+                <w:sz w:val="20"/>
+              </w:rPr>
+            </w:pPr>
+          </w:p>
+        </w:tc>
+        <w:tc>
+          <w:tcPr>
+            <w:tcW w:w="6264" w:type="dxa"/>
+            <w:tcMar>
+              <w:top w:w="80" w:type="dxa"/>
+              <w:left w:w="120" w:type="dxa"/>
+              <w:bottom w:w="80" w:type="dxa"/>
+              <w:right w:w="120" w:type="dxa"/>
+            </w:tcMar>
+            <w:vAlign w:val="center"/>
+          </w:tcPr>
+          <w:p>
+            <w:pPr>
+              <w:spacing w:after="0" w:line="269" w:lineRule="auto"/>
+              <w:rPr>
+                <w:sz w:val="20"/>
+              </w:rPr>
+            </w:pPr>
+            <w:r>
+              <w:rPr>
+                <w:sz w:val="20"/>
+              </w:rPr>
+              <w:t>On ‘</w:t>
+            </w:r>
+            <w:r>
+              <w:rPr>
+                <w:b/>
+                <w:bCs/>
+                <w:sz w:val="20"/>
+              </w:rPr>
+              <w:t>Conversation Management</w:t>
+            </w:r>
+            <w:r>
+              <w:rPr>
+                <w:sz w:val="20"/>
+              </w:rPr>
+              <w:t xml:space="preserve">’ page: </w:t>
+            </w:r>
+          </w:p>
+          <w:p>
+            <w:pPr>
+              <w:spacing w:after="0" w:line="269" w:lineRule="auto"/>
+              <w:rPr>
+                <w:sz w:val="20"/>
+                <w:lang w:val="en-CA"/>
+              </w:rPr>
+            </w:pPr>
+            <w:r>
+              <w:rPr>
+                <w:sz w:val="20"/>
+                <w:lang w:val="en-CA"/>
+              </w:rPr>
+              <w:t>No Delete Access.</w:t>
+            </w:r>
+          </w:p>
+        </w:tc>
+      </w:tr>
+    </w:tbl>
+    <w:p/>
+    <w:tbl>
+      <w:tblPr>
+        <w:tblStyle w:val="TableGrid"/>
+        <w:tblW w:w="9360" w:type="dxa"/>
+        <w:tblInd w:w="120" w:type="dxa"/>
+        <w:tblLayout w:type="fixed"/>
+        <w:tblLook w:val="04A0" w:firstRow="1" w:lastRow="0" w:firstColumn="1" w:lastColumn="0" w:noHBand="0" w:noVBand="1"/>
+      </w:tblPr>
+      <w:tblGrid>
+        <w:gridCol w:w="1440"/>
+        <w:gridCol w:w="1656"/>
+        <w:gridCol w:w="6264"/>
+      </w:tblGrid>
+      <w:tr>
+        <w:tc>
+          <w:tcPr>
+            <w:tcW w:w="1440" w:type="dxa"/>
+            <w:tcMar>
+              <w:top w:w="80" w:type="dxa"/>
+              <w:left w:w="120" w:type="dxa"/>
+              <w:bottom w:w="80" w:type="dxa"/>
+              <w:right w:w="120" w:type="dxa"/>
+            </w:tcMar>
+            <w:vAlign w:val="center"/>
+          </w:tcPr>
+          <w:p>
+            <w:pPr>
+              <w:spacing w:after="0" w:line="269" w:lineRule="auto"/>
+            </w:pPr>
+            <w:r>
+              <w:rPr>
+                <w:b/>
+                <w:color w:val="1F4D78"/>
+                <w:sz w:val="20"/>
+              </w:rPr>
+              <w:lastRenderedPageBreak/>
+              <w:t>DELETE_ALL</w:t>
+            </w:r>
+          </w:p>
+        </w:tc>
+        <w:tc>
+          <w:tcPr>
+            <w:tcW w:w="1656" w:type="dxa"/>
+            <w:tcMar>
+              <w:top w:w="80" w:type="dxa"/>
+              <w:left w:w="120" w:type="dxa"/>
+              <w:bottom w:w="80" w:type="dxa"/>
+              <w:right w:w="120" w:type="dxa"/>
+            </w:tcMar>
+            <w:vAlign w:val="center"/>
+          </w:tcPr>
+          <w:p>
+            <w:pPr>
+              <w:spacing w:after="0" w:line="269" w:lineRule="auto"/>
+            </w:pPr>
+            <w:r>
+              <w:rPr>
+                <w:b/>
+                <w:sz w:val="20"/>
+              </w:rPr>
+              <w:t>USER</w:t>
+            </w:r>
+          </w:p>
+        </w:tc>
+        <w:tc>
+          <w:tcPr>
+            <w:tcW w:w="6264" w:type="dxa"/>
+            <w:tcMar>
+              <w:top w:w="80" w:type="dxa"/>
+              <w:left w:w="120" w:type="dxa"/>
+              <w:bottom w:w="80" w:type="dxa"/>
+              <w:right w:w="120" w:type="dxa"/>
+            </w:tcMar>
+            <w:vAlign w:val="center"/>
+          </w:tcPr>
+          <w:p>
+            <w:pPr>
+              <w:spacing w:after="0" w:line="269" w:lineRule="auto"/>
+            </w:pPr>
+            <w:r>
+              <w:rPr>
+                <w:sz w:val="20"/>
+              </w:rPr>
+              <w:t>No Access.</w:t>
             </w:r>
           </w:p>
         </w:tc>
@@ -5912,7 +6029,7 @@
                 <w:color w:val="1F4D78"/>
                 <w:sz w:val="20"/>
               </w:rPr>
-              <w:t>DELETE</w:t>
+              <w:t>DELETE_ALL</w:t>
             </w:r>
           </w:p>
         </w:tc>
@@ -5936,7 +6053,7 @@
                 <w:b/>
                 <w:sz w:val="20"/>
               </w:rPr>
-              <w:t>ORGANIZATION</w:t>
+              <w:t>OWNER</w:t>
             </w:r>
           </w:p>
         </w:tc>
@@ -5959,7 +6076,7 @@
               <w:rPr>
                 <w:sz w:val="20"/>
               </w:rPr>
-              <w:t>Can delete either participant's messages, including mixed multi-select, when every participant has active role-bearing membership in the active organization. Can delete the whole conversation inside that organization.</w:t>
+              <w:t>No Access</w:t>
             </w:r>
           </w:p>
         </w:tc>
@@ -5986,7 +6103,7 @@
                 <w:color w:val="1F4D78"/>
                 <w:sz w:val="20"/>
               </w:rPr>
-              <w:t>DELETE</w:t>
+              <w:t>DELETE_ALL</w:t>
             </w:r>
           </w:p>
         </w:tc>
@@ -6010,7 +6127,19 @@
                 <w:b/>
                 <w:sz w:val="20"/>
               </w:rPr>
-              <w:t>ADMIN</w:t>
+              <w:t>DEPARTMENT/</w:t>
+            </w:r>
+          </w:p>
+          <w:p>
+            <w:pPr>
+              <w:spacing w:after="0" w:line="269" w:lineRule="auto"/>
+            </w:pPr>
+            <w:r>
+              <w:rPr>
+                <w:b/>
+                <w:sz w:val="20"/>
+              </w:rPr>
+              <w:t>DIVISION</w:t>
             </w:r>
           </w:p>
         </w:tc>
@@ -6033,21 +6162,7 @@
               <w:rPr>
                 <w:sz w:val="20"/>
               </w:rPr>
-              <w:t xml:space="preserve">Can delete either participant's messages </w:t>
-            </w:r>
-            <w:proofErr w:type="gramStart"/>
-            <w:r>
-              <w:rPr>
-                <w:sz w:val="20"/>
-              </w:rPr>
-              <w:t>and</w:t>
-            </w:r>
-            <w:proofErr w:type="gramEnd"/>
-            <w:r>
-              <w:rPr>
-                <w:sz w:val="20"/>
-              </w:rPr>
-              <w:t xml:space="preserve"> whole conversations within the resolved administrative boundary, provided every participant remains within that boundary. ADMIN does not give global deletion outside it.</w:t>
+              <w:t>No Access.</w:t>
             </w:r>
           </w:p>
         </w:tc>
@@ -6074,7 +6189,7 @@
                 <w:color w:val="1F4D78"/>
                 <w:sz w:val="20"/>
               </w:rPr>
-              <w:t>DELETE</w:t>
+              <w:t>DELETE_ALL</w:t>
             </w:r>
           </w:p>
         </w:tc>
@@ -6092,13 +6207,36 @@
           <w:p>
             <w:pPr>
               <w:spacing w:after="0" w:line="269" w:lineRule="auto"/>
-            </w:pPr>
-            <w:r>
               <w:rPr>
                 <w:b/>
                 <w:sz w:val="20"/>
               </w:rPr>
-              <w:t>GLOBAL</w:t>
+            </w:pPr>
+            <w:r>
+              <w:rPr>
+                <w:b/>
+                <w:sz w:val="20"/>
+              </w:rPr>
+              <w:t>ORGANIZATION</w:t>
+            </w:r>
+            <w:r>
+              <w:rPr>
+                <w:b/>
+                <w:sz w:val="20"/>
+              </w:rPr>
+              <w:t>/</w:t>
+            </w:r>
+          </w:p>
+          <w:p>
+            <w:pPr>
+              <w:spacing w:after="0" w:line="269" w:lineRule="auto"/>
+            </w:pPr>
+            <w:r>
+              <w:rPr>
+                <w:b/>
+                <w:sz w:val="20"/>
+              </w:rPr>
+              <w:t>ADMIN</w:t>
             </w:r>
           </w:p>
         </w:tc>
@@ -6116,720 +6254,48 @@
           <w:p>
             <w:pPr>
               <w:spacing w:after="0" w:line="269" w:lineRule="auto"/>
-            </w:pPr>
-            <w:r>
-              <w:rPr>
-                <w:sz w:val="20"/>
-              </w:rPr>
-              <w:t xml:space="preserve">Can delete any authorized message or whole conversation across boundaries. Single and bulk message deletion remain soft deletes; a whole-conversation deletion follows the existing conversation cleanup </w:t>
-            </w:r>
-            <w:r>
-              <w:rPr>
-                <w:sz w:val="20"/>
-              </w:rPr>
-              <w:lastRenderedPageBreak/>
-              <w:t>path.</w:t>
-            </w:r>
-          </w:p>
-        </w:tc>
-      </w:tr>
-      <w:tr>
-        <w:tc>
-          <w:tcPr>
-            <w:tcW w:w="1440" w:type="dxa"/>
-            <w:tcMar>
-              <w:top w:w="80" w:type="dxa"/>
-              <w:left w:w="120" w:type="dxa"/>
-              <w:bottom w:w="80" w:type="dxa"/>
-              <w:right w:w="120" w:type="dxa"/>
-            </w:tcMar>
-            <w:vAlign w:val="center"/>
-          </w:tcPr>
-          <w:p>
-            <w:pPr>
-              <w:spacing w:after="0" w:line="269" w:lineRule="auto"/>
-            </w:pPr>
+              <w:rPr>
+                <w:sz w:val="20"/>
+              </w:rPr>
+            </w:pPr>
+            <w:r>
+              <w:rPr>
+                <w:sz w:val="20"/>
+              </w:rPr>
+              <w:t>On ‘</w:t>
+            </w:r>
             <w:r>
               <w:rPr>
                 <w:b/>
-                <w:color w:val="1F4D78"/>
-                <w:sz w:val="20"/>
-              </w:rPr>
-              <w:lastRenderedPageBreak/>
-              <w:t>DELETE_ALL</w:t>
-            </w:r>
-          </w:p>
-        </w:tc>
-        <w:tc>
-          <w:tcPr>
-            <w:tcW w:w="1656" w:type="dxa"/>
-            <w:tcMar>
-              <w:top w:w="80" w:type="dxa"/>
-              <w:left w:w="120" w:type="dxa"/>
-              <w:bottom w:w="80" w:type="dxa"/>
-              <w:right w:w="120" w:type="dxa"/>
-            </w:tcMar>
-            <w:vAlign w:val="center"/>
-          </w:tcPr>
-          <w:p>
-            <w:pPr>
-              <w:spacing w:after="0" w:line="269" w:lineRule="auto"/>
-            </w:pPr>
-            <w:r>
-              <w:rPr>
-                <w:b/>
-                <w:sz w:val="20"/>
-              </w:rPr>
-              <w:t>USER</w:t>
-            </w:r>
-          </w:p>
-        </w:tc>
-        <w:tc>
-          <w:tcPr>
-            <w:tcW w:w="6264" w:type="dxa"/>
-            <w:tcMar>
-              <w:top w:w="80" w:type="dxa"/>
-              <w:left w:w="120" w:type="dxa"/>
-              <w:bottom w:w="80" w:type="dxa"/>
-              <w:right w:w="120" w:type="dxa"/>
-            </w:tcMar>
-            <w:vAlign w:val="center"/>
-          </w:tcPr>
-          <w:p>
-            <w:pPr>
-              <w:spacing w:after="0" w:line="269" w:lineRule="auto"/>
-            </w:pPr>
-            <w:r>
-              <w:rPr>
-                <w:sz w:val="20"/>
-              </w:rPr>
-              <w:t xml:space="preserve">Can see and manage the global deletion/broadcast surface. </w:t>
-            </w:r>
-            <w:proofErr w:type="gramStart"/>
-            <w:r>
-              <w:rPr>
-                <w:sz w:val="20"/>
-              </w:rPr>
-              <w:t>Can</w:t>
-            </w:r>
-            <w:proofErr w:type="gramEnd"/>
-            <w:r>
-              <w:rPr>
-                <w:sz w:val="20"/>
-              </w:rPr>
-              <w:t xml:space="preserve"> delete any message or whole conversation across </w:t>
-            </w:r>
-            <w:proofErr w:type="gramStart"/>
-            <w:r>
-              <w:rPr>
-                <w:sz w:val="20"/>
-              </w:rPr>
-              <w:t>boundaries, and</w:t>
-            </w:r>
-            <w:proofErr w:type="gramEnd"/>
-            <w:r>
-              <w:rPr>
-                <w:sz w:val="20"/>
-              </w:rPr>
-              <w:t xml:space="preserve"> can search broadcast recipients and send broadcast direct-message fan-out. This is global destructive authority; the displayed scope does not narrow it in the current implementation.</w:t>
-            </w:r>
-          </w:p>
-        </w:tc>
-      </w:tr>
-      <w:tr>
-        <w:tc>
-          <w:tcPr>
-            <w:tcW w:w="1440" w:type="dxa"/>
-            <w:tcMar>
-              <w:top w:w="80" w:type="dxa"/>
-              <w:left w:w="120" w:type="dxa"/>
-              <w:bottom w:w="80" w:type="dxa"/>
-              <w:right w:w="120" w:type="dxa"/>
-            </w:tcMar>
-            <w:vAlign w:val="center"/>
-          </w:tcPr>
-          <w:p>
-            <w:pPr>
-              <w:spacing w:after="0" w:line="269" w:lineRule="auto"/>
-            </w:pPr>
-            <w:r>
-              <w:rPr>
-                <w:b/>
-                <w:color w:val="1F4D78"/>
-                <w:sz w:val="20"/>
-              </w:rPr>
-              <w:t>DELETE_ALL</w:t>
-            </w:r>
-          </w:p>
-        </w:tc>
-        <w:tc>
-          <w:tcPr>
-            <w:tcW w:w="1656" w:type="dxa"/>
-            <w:tcMar>
-              <w:top w:w="80" w:type="dxa"/>
-              <w:left w:w="120" w:type="dxa"/>
-              <w:bottom w:w="80" w:type="dxa"/>
-              <w:right w:w="120" w:type="dxa"/>
-            </w:tcMar>
-            <w:vAlign w:val="center"/>
-          </w:tcPr>
-          <w:p>
-            <w:pPr>
-              <w:spacing w:after="0" w:line="269" w:lineRule="auto"/>
-            </w:pPr>
-            <w:r>
-              <w:rPr>
-                <w:b/>
-                <w:sz w:val="20"/>
-              </w:rPr>
-              <w:t>OWNER</w:t>
-            </w:r>
-          </w:p>
-        </w:tc>
-        <w:tc>
-          <w:tcPr>
-            <w:tcW w:w="6264" w:type="dxa"/>
-            <w:tcMar>
-              <w:top w:w="80" w:type="dxa"/>
-              <w:left w:w="120" w:type="dxa"/>
-              <w:bottom w:w="80" w:type="dxa"/>
-              <w:right w:w="120" w:type="dxa"/>
-            </w:tcMar>
-            <w:vAlign w:val="center"/>
-          </w:tcPr>
-          <w:p>
-            <w:pPr>
-              <w:spacing w:after="0" w:line="269" w:lineRule="auto"/>
-            </w:pPr>
-            <w:r>
-              <w:rPr>
-                <w:sz w:val="20"/>
-              </w:rPr>
-              <w:t xml:space="preserve">Can see and manage the global deletion/broadcast surface. </w:t>
-            </w:r>
-            <w:proofErr w:type="gramStart"/>
-            <w:r>
-              <w:rPr>
-                <w:sz w:val="20"/>
-              </w:rPr>
-              <w:t>Can</w:t>
-            </w:r>
-            <w:proofErr w:type="gramEnd"/>
-            <w:r>
-              <w:rPr>
-                <w:sz w:val="20"/>
-              </w:rPr>
-              <w:t xml:space="preserve"> delete any message or whole conversation across boundaries, and can search broadcast recipients and send broadcast direct-message fan-out. This is global destructive authority; the displayed scope does not narrow it in the current implementation.</w:t>
-            </w:r>
-          </w:p>
-        </w:tc>
-      </w:tr>
-      <w:tr>
-        <w:tc>
-          <w:tcPr>
-            <w:tcW w:w="1440" w:type="dxa"/>
-            <w:tcMar>
-              <w:top w:w="80" w:type="dxa"/>
-              <w:left w:w="120" w:type="dxa"/>
-              <w:bottom w:w="80" w:type="dxa"/>
-              <w:right w:w="120" w:type="dxa"/>
-            </w:tcMar>
-            <w:vAlign w:val="center"/>
-          </w:tcPr>
-          <w:p>
-            <w:pPr>
-              <w:spacing w:after="0" w:line="269" w:lineRule="auto"/>
-            </w:pPr>
-            <w:r>
-              <w:rPr>
-                <w:b/>
-                <w:color w:val="1F4D78"/>
-                <w:sz w:val="20"/>
-              </w:rPr>
-              <w:t>DELETE_ALL</w:t>
-            </w:r>
-          </w:p>
-        </w:tc>
-        <w:tc>
-          <w:tcPr>
-            <w:tcW w:w="1656" w:type="dxa"/>
-            <w:tcMar>
-              <w:top w:w="80" w:type="dxa"/>
-              <w:left w:w="120" w:type="dxa"/>
-              <w:bottom w:w="80" w:type="dxa"/>
-              <w:right w:w="120" w:type="dxa"/>
-            </w:tcMar>
-            <w:vAlign w:val="center"/>
-          </w:tcPr>
-          <w:p>
-            <w:pPr>
-              <w:spacing w:after="0" w:line="269" w:lineRule="auto"/>
-            </w:pPr>
-            <w:r>
-              <w:rPr>
-                <w:b/>
-                <w:sz w:val="20"/>
-              </w:rPr>
-              <w:t>DEPARTMENT</w:t>
-            </w:r>
-          </w:p>
-        </w:tc>
-        <w:tc>
-          <w:tcPr>
-            <w:tcW w:w="6264" w:type="dxa"/>
-            <w:tcMar>
-              <w:top w:w="80" w:type="dxa"/>
-              <w:left w:w="120" w:type="dxa"/>
-              <w:bottom w:w="80" w:type="dxa"/>
-              <w:right w:w="120" w:type="dxa"/>
-            </w:tcMar>
-            <w:vAlign w:val="center"/>
-          </w:tcPr>
-          <w:p>
-            <w:pPr>
-              <w:spacing w:after="0" w:line="269" w:lineRule="auto"/>
-            </w:pPr>
-            <w:r>
-              <w:rPr>
-                <w:sz w:val="20"/>
-              </w:rPr>
-              <w:t xml:space="preserve">Can see and manage the global deletion/broadcast surface. </w:t>
-            </w:r>
-            <w:proofErr w:type="gramStart"/>
-            <w:r>
-              <w:rPr>
-                <w:sz w:val="20"/>
-              </w:rPr>
-              <w:t>Can</w:t>
-            </w:r>
-            <w:proofErr w:type="gramEnd"/>
-            <w:r>
-              <w:rPr>
-                <w:sz w:val="20"/>
-              </w:rPr>
-              <w:t xml:space="preserve"> delete any message or whole conversation across </w:t>
-            </w:r>
-            <w:proofErr w:type="gramStart"/>
-            <w:r>
-              <w:rPr>
-                <w:sz w:val="20"/>
-              </w:rPr>
-              <w:t>boundaries, and</w:t>
-            </w:r>
-            <w:proofErr w:type="gramEnd"/>
-            <w:r>
-              <w:rPr>
-                <w:sz w:val="20"/>
-              </w:rPr>
-              <w:t xml:space="preserve"> can search broadcast recipients and send broadcast direct-message fan-out. This is global destructive authority; the displayed scope does not narrow it in the current implementation.</w:t>
-            </w:r>
-          </w:p>
-        </w:tc>
-      </w:tr>
-      <w:tr>
-        <w:tc>
-          <w:tcPr>
-            <w:tcW w:w="1440" w:type="dxa"/>
-            <w:tcMar>
-              <w:top w:w="80" w:type="dxa"/>
-              <w:left w:w="120" w:type="dxa"/>
-              <w:bottom w:w="80" w:type="dxa"/>
-              <w:right w:w="120" w:type="dxa"/>
-            </w:tcMar>
-            <w:vAlign w:val="center"/>
-          </w:tcPr>
-          <w:p>
-            <w:pPr>
-              <w:spacing w:after="0" w:line="269" w:lineRule="auto"/>
-            </w:pPr>
-            <w:r>
-              <w:rPr>
-                <w:b/>
-                <w:color w:val="1F4D78"/>
-                <w:sz w:val="20"/>
-              </w:rPr>
-              <w:t>DELETE_ALL</w:t>
-            </w:r>
-          </w:p>
-        </w:tc>
-        <w:tc>
-          <w:tcPr>
-            <w:tcW w:w="1656" w:type="dxa"/>
-            <w:tcMar>
-              <w:top w:w="80" w:type="dxa"/>
-              <w:left w:w="120" w:type="dxa"/>
-              <w:bottom w:w="80" w:type="dxa"/>
-              <w:right w:w="120" w:type="dxa"/>
-            </w:tcMar>
-            <w:vAlign w:val="center"/>
-          </w:tcPr>
-          <w:p>
-            <w:pPr>
-              <w:spacing w:after="0" w:line="269" w:lineRule="auto"/>
-            </w:pPr>
-            <w:r>
-              <w:rPr>
-                <w:b/>
-                <w:sz w:val="20"/>
-              </w:rPr>
-              <w:t>DIVISION</w:t>
-            </w:r>
-          </w:p>
-        </w:tc>
-        <w:tc>
-          <w:tcPr>
-            <w:tcW w:w="6264" w:type="dxa"/>
-            <w:tcMar>
-              <w:top w:w="80" w:type="dxa"/>
-              <w:left w:w="120" w:type="dxa"/>
-              <w:bottom w:w="80" w:type="dxa"/>
-              <w:right w:w="120" w:type="dxa"/>
-            </w:tcMar>
-            <w:vAlign w:val="center"/>
-          </w:tcPr>
-          <w:p>
-            <w:pPr>
-              <w:spacing w:after="0" w:line="269" w:lineRule="auto"/>
-            </w:pPr>
-            <w:r>
-              <w:rPr>
-                <w:sz w:val="20"/>
-              </w:rPr>
-              <w:t xml:space="preserve">Can see and manage the global deletion/broadcast surface. </w:t>
-            </w:r>
-            <w:proofErr w:type="gramStart"/>
-            <w:r>
-              <w:rPr>
-                <w:sz w:val="20"/>
-              </w:rPr>
-              <w:t>Can</w:t>
-            </w:r>
-            <w:proofErr w:type="gramEnd"/>
-            <w:r>
-              <w:rPr>
-                <w:sz w:val="20"/>
-              </w:rPr>
-              <w:t xml:space="preserve"> delete any message or whole conversation across </w:t>
-            </w:r>
-            <w:proofErr w:type="gramStart"/>
-            <w:r>
-              <w:rPr>
-                <w:sz w:val="20"/>
-              </w:rPr>
-              <w:t>boundaries, and</w:t>
-            </w:r>
-            <w:proofErr w:type="gramEnd"/>
-            <w:r>
-              <w:rPr>
-                <w:sz w:val="20"/>
-              </w:rPr>
-              <w:t xml:space="preserve"> can search broadcast recipients and send broadcast direct-message fan-out. This is global destructive authority; the displayed scope does not narrow it in the current implementation.</w:t>
-            </w:r>
-          </w:p>
-        </w:tc>
-      </w:tr>
-      <w:tr>
-        <w:tc>
-          <w:tcPr>
-            <w:tcW w:w="1440" w:type="dxa"/>
-            <w:tcMar>
-              <w:top w:w="80" w:type="dxa"/>
-              <w:left w:w="120" w:type="dxa"/>
-              <w:bottom w:w="80" w:type="dxa"/>
-              <w:right w:w="120" w:type="dxa"/>
-            </w:tcMar>
-            <w:vAlign w:val="center"/>
-          </w:tcPr>
-          <w:p>
-            <w:pPr>
-              <w:spacing w:after="0" w:line="269" w:lineRule="auto"/>
-            </w:pPr>
-            <w:r>
-              <w:rPr>
-                <w:b/>
-                <w:color w:val="1F4D78"/>
-                <w:sz w:val="20"/>
-              </w:rPr>
-              <w:t>DELETE_ALL</w:t>
-            </w:r>
-          </w:p>
-        </w:tc>
-        <w:tc>
-          <w:tcPr>
-            <w:tcW w:w="1656" w:type="dxa"/>
-            <w:tcMar>
-              <w:top w:w="80" w:type="dxa"/>
-              <w:left w:w="120" w:type="dxa"/>
-              <w:bottom w:w="80" w:type="dxa"/>
-              <w:right w:w="120" w:type="dxa"/>
-            </w:tcMar>
-            <w:vAlign w:val="center"/>
-          </w:tcPr>
-          <w:p>
-            <w:pPr>
-              <w:spacing w:after="0" w:line="269" w:lineRule="auto"/>
-            </w:pPr>
-            <w:r>
-              <w:rPr>
-                <w:b/>
-                <w:sz w:val="20"/>
-              </w:rPr>
-              <w:t>ORGANIZATION</w:t>
-            </w:r>
-          </w:p>
-        </w:tc>
-        <w:tc>
-          <w:tcPr>
-            <w:tcW w:w="6264" w:type="dxa"/>
-            <w:tcMar>
-              <w:top w:w="80" w:type="dxa"/>
-              <w:left w:w="120" w:type="dxa"/>
-              <w:bottom w:w="80" w:type="dxa"/>
-              <w:right w:w="120" w:type="dxa"/>
-            </w:tcMar>
-            <w:vAlign w:val="center"/>
-          </w:tcPr>
-          <w:p>
-            <w:pPr>
-              <w:spacing w:after="0" w:line="269" w:lineRule="auto"/>
-            </w:pPr>
-            <w:r>
-              <w:rPr>
-                <w:sz w:val="20"/>
-              </w:rPr>
-              <w:t xml:space="preserve">Can see and manage the global deletion/broadcast surface. </w:t>
-            </w:r>
-            <w:proofErr w:type="gramStart"/>
-            <w:r>
-              <w:rPr>
-                <w:sz w:val="20"/>
-              </w:rPr>
-              <w:t>Can</w:t>
-            </w:r>
-            <w:proofErr w:type="gramEnd"/>
-            <w:r>
-              <w:rPr>
-                <w:sz w:val="20"/>
-              </w:rPr>
-              <w:t xml:space="preserve"> delete any message or whole conversation across </w:t>
-            </w:r>
-            <w:proofErr w:type="gramStart"/>
-            <w:r>
-              <w:rPr>
-                <w:sz w:val="20"/>
-              </w:rPr>
-              <w:t>boundaries, and</w:t>
-            </w:r>
-            <w:proofErr w:type="gramEnd"/>
-            <w:r>
-              <w:rPr>
-                <w:sz w:val="20"/>
-              </w:rPr>
-              <w:t xml:space="preserve"> can search broadcast recipients and send broadcast direct-message fan-out. This is global destructive authority; the displayed scope does not narrow it in the current implementation.</w:t>
-            </w:r>
-          </w:p>
-        </w:tc>
-      </w:tr>
-      <w:tr>
-        <w:tc>
-          <w:tcPr>
-            <w:tcW w:w="1440" w:type="dxa"/>
-            <w:tcMar>
-              <w:top w:w="80" w:type="dxa"/>
-              <w:left w:w="120" w:type="dxa"/>
-              <w:bottom w:w="80" w:type="dxa"/>
-              <w:right w:w="120" w:type="dxa"/>
-            </w:tcMar>
-            <w:vAlign w:val="center"/>
-          </w:tcPr>
-          <w:p>
-            <w:pPr>
-              <w:spacing w:after="0" w:line="269" w:lineRule="auto"/>
-            </w:pPr>
-            <w:r>
-              <w:rPr>
-                <w:b/>
-                <w:color w:val="1F4D78"/>
-                <w:sz w:val="20"/>
-              </w:rPr>
-              <w:t>DELETE_ALL</w:t>
-            </w:r>
-          </w:p>
-        </w:tc>
-        <w:tc>
-          <w:tcPr>
-            <w:tcW w:w="1656" w:type="dxa"/>
-            <w:tcMar>
-              <w:top w:w="80" w:type="dxa"/>
-              <w:left w:w="120" w:type="dxa"/>
-              <w:bottom w:w="80" w:type="dxa"/>
-              <w:right w:w="120" w:type="dxa"/>
-            </w:tcMar>
-            <w:vAlign w:val="center"/>
-          </w:tcPr>
-          <w:p>
-            <w:pPr>
-              <w:spacing w:after="0" w:line="269" w:lineRule="auto"/>
-            </w:pPr>
-            <w:r>
-              <w:rPr>
-                <w:b/>
-                <w:sz w:val="20"/>
-              </w:rPr>
-              <w:t>ADMIN</w:t>
-            </w:r>
-          </w:p>
-        </w:tc>
-        <w:tc>
-          <w:tcPr>
-            <w:tcW w:w="6264" w:type="dxa"/>
-            <w:tcMar>
-              <w:top w:w="80" w:type="dxa"/>
-              <w:left w:w="120" w:type="dxa"/>
-              <w:bottom w:w="80" w:type="dxa"/>
-              <w:right w:w="120" w:type="dxa"/>
-            </w:tcMar>
-            <w:vAlign w:val="center"/>
-          </w:tcPr>
-          <w:p>
-            <w:pPr>
-              <w:spacing w:after="0" w:line="269" w:lineRule="auto"/>
-            </w:pPr>
-            <w:r>
-              <w:rPr>
-                <w:sz w:val="20"/>
-              </w:rPr>
-              <w:t xml:space="preserve">Can see and manage the global deletion/broadcast surface. </w:t>
-            </w:r>
-            <w:proofErr w:type="gramStart"/>
-            <w:r>
-              <w:rPr>
-                <w:sz w:val="20"/>
-              </w:rPr>
-              <w:t>Can</w:t>
-            </w:r>
-            <w:proofErr w:type="gramEnd"/>
-            <w:r>
-              <w:rPr>
-                <w:sz w:val="20"/>
-              </w:rPr>
-              <w:t xml:space="preserve"> delete any message or whole conversation across </w:t>
-            </w:r>
-            <w:proofErr w:type="gramStart"/>
-            <w:r>
-              <w:rPr>
-                <w:sz w:val="20"/>
-              </w:rPr>
-              <w:t>boundaries, and</w:t>
-            </w:r>
-            <w:proofErr w:type="gramEnd"/>
-            <w:r>
-              <w:rPr>
-                <w:sz w:val="20"/>
-              </w:rPr>
-              <w:t xml:space="preserve"> can search broadcast recipients and send broadcast direct-message fan-out. This is global destructive authority; the displayed scope does not narrow it in the current implementation.</w:t>
-            </w:r>
-          </w:p>
-        </w:tc>
-      </w:tr>
-      <w:tr>
-        <w:tc>
-          <w:tcPr>
-            <w:tcW w:w="1440" w:type="dxa"/>
-            <w:tcMar>
-              <w:top w:w="80" w:type="dxa"/>
-              <w:left w:w="120" w:type="dxa"/>
-              <w:bottom w:w="80" w:type="dxa"/>
-              <w:right w:w="120" w:type="dxa"/>
-            </w:tcMar>
-            <w:vAlign w:val="center"/>
-          </w:tcPr>
-          <w:p>
-            <w:pPr>
-              <w:spacing w:after="0" w:line="269" w:lineRule="auto"/>
-            </w:pPr>
-            <w:r>
-              <w:rPr>
-                <w:b/>
-                <w:color w:val="1F4D78"/>
-                <w:sz w:val="20"/>
-              </w:rPr>
-              <w:t>DELETE_ALL</w:t>
-            </w:r>
-          </w:p>
-        </w:tc>
-        <w:tc>
-          <w:tcPr>
-            <w:tcW w:w="1656" w:type="dxa"/>
-            <w:tcMar>
-              <w:top w:w="80" w:type="dxa"/>
-              <w:left w:w="120" w:type="dxa"/>
-              <w:bottom w:w="80" w:type="dxa"/>
-              <w:right w:w="120" w:type="dxa"/>
-            </w:tcMar>
-            <w:vAlign w:val="center"/>
-          </w:tcPr>
-          <w:p>
-            <w:pPr>
-              <w:spacing w:after="0" w:line="269" w:lineRule="auto"/>
-            </w:pPr>
-            <w:r>
-              <w:rPr>
-                <w:b/>
-                <w:sz w:val="20"/>
-              </w:rPr>
-              <w:t>GLOBAL</w:t>
-            </w:r>
-          </w:p>
-        </w:tc>
-        <w:tc>
-          <w:tcPr>
-            <w:tcW w:w="6264" w:type="dxa"/>
-            <w:tcMar>
-              <w:top w:w="80" w:type="dxa"/>
-              <w:left w:w="120" w:type="dxa"/>
-              <w:bottom w:w="80" w:type="dxa"/>
-              <w:right w:w="120" w:type="dxa"/>
-            </w:tcMar>
-            <w:vAlign w:val="center"/>
-          </w:tcPr>
-          <w:p>
-            <w:pPr>
-              <w:spacing w:after="0" w:line="269" w:lineRule="auto"/>
-            </w:pPr>
-            <w:r>
-              <w:rPr>
-                <w:sz w:val="20"/>
-              </w:rPr>
-              <w:t xml:space="preserve">Can see and manage the global deletion/broadcast surface. </w:t>
-            </w:r>
-            <w:proofErr w:type="gramStart"/>
-            <w:r>
-              <w:rPr>
-                <w:sz w:val="20"/>
-              </w:rPr>
-              <w:t>Can</w:t>
-            </w:r>
-            <w:proofErr w:type="gramEnd"/>
-            <w:r>
-              <w:rPr>
-                <w:sz w:val="20"/>
-              </w:rPr>
-              <w:t xml:space="preserve"> delete any message or whole conversation across </w:t>
-            </w:r>
-            <w:proofErr w:type="gramStart"/>
-            <w:r>
-              <w:rPr>
-                <w:sz w:val="20"/>
-              </w:rPr>
-              <w:t>boundaries, and</w:t>
-            </w:r>
-            <w:proofErr w:type="gramEnd"/>
-            <w:r>
-              <w:rPr>
-                <w:sz w:val="20"/>
-              </w:rPr>
-              <w:t xml:space="preserve"> can search broadcast recipients and send broadcast direct-message fan-out. This is global destructive authority; the displayed scope does not narrow it in the current implementation.</w:t>
+                <w:bCs/>
+                <w:sz w:val="20"/>
+              </w:rPr>
+              <w:t>Conversation Management</w:t>
+            </w:r>
+            <w:r>
+              <w:rPr>
+                <w:sz w:val="20"/>
+              </w:rPr>
+              <w:t xml:space="preserve">’ page: </w:t>
+            </w:r>
+          </w:p>
+          <w:p>
+            <w:pPr>
+              <w:spacing w:after="0" w:line="269" w:lineRule="auto"/>
+            </w:pPr>
+            <w:r>
+              <w:rPr>
+                <w:sz w:val="20"/>
+                <w:lang w:val="en-CA"/>
+              </w:rPr>
+              <w:t>Can delete any conversation</w:t>
+            </w:r>
+            <w:r>
+              <w:rPr>
+                <w:sz w:val="20"/>
+                <w:lang w:val="en-CA"/>
+              </w:rPr>
+              <w:t>.</w:t>
             </w:r>
           </w:p>
         </w:tc>
@@ -6839,45 +6305,6 @@
       <w:pPr>
         <w:spacing w:before="160" w:after="0"/>
       </w:pPr>
-      <w:r>
-        <w:rPr>
-          <w:color w:val="5B6573"/>
-          <w:sz w:val="18"/>
-        </w:rPr>
-        <w:t xml:space="preserve">Important: READ remains participant-only. READ_ALL is the separate global audit/history operation. DELETE_ALL remains global </w:t>
-      </w:r>
-      <w:proofErr w:type="gramStart"/>
-      <w:r>
-        <w:rPr>
-          <w:color w:val="5B6573"/>
-          <w:sz w:val="18"/>
-        </w:rPr>
-        <w:t>and also</w:t>
-      </w:r>
-      <w:proofErr w:type="gramEnd"/>
-      <w:r>
-        <w:rPr>
-          <w:color w:val="5B6573"/>
-          <w:sz w:val="18"/>
-        </w:rPr>
-        <w:t xml:space="preserve"> governs broadcast until a dedicated broadcast operation </w:t>
-      </w:r>
-      <w:proofErr w:type="gramStart"/>
-      <w:r>
-        <w:rPr>
-          <w:color w:val="5B6573"/>
-          <w:sz w:val="18"/>
-        </w:rPr>
-        <w:t>is introduced</w:t>
-      </w:r>
-      <w:proofErr w:type="gramEnd"/>
-      <w:r>
-        <w:rPr>
-          <w:color w:val="5B6573"/>
-          <w:sz w:val="18"/>
-        </w:rPr>
-        <w:t>.</w:t>
-      </w:r>
     </w:p>
     <w:sectPr>
       <w:headerReference w:type="default" r:id="rId8"/>
@@ -8052,7 +7479,7 @@
   <w:style w:type="paragraph" w:default="1" w:styleId="Normal">
     <w:name w:val="Normal"/>
     <w:qFormat/>
-    <w:rsid w:val="00016474"/>
+    <w:rsid w:val="002E6AFE"/>
     <w:pPr>
       <w:spacing w:after="120" w:line="300" w:lineRule="auto"/>
     </w:pPr>
@@ -8272,6 +7699,7 @@
   <w:style w:type="character" w:default="1" w:styleId="DefaultParagraphFont">
     <w:name w:val="Default Paragraph Font"/>
     <w:uiPriority w:val="1"/>
+    <w:semiHidden/>
     <w:unhideWhenUsed/>
   </w:style>
   <w:style w:type="table" w:default="1" w:styleId="TableNormal">

</xml_diff>